<commit_message>
Update official contact details and social links
</commit_message>
<xml_diff>
--- a/documents/courriers-lancement-saint-etienne/01-ville-local-stockage.docx
+++ b/documents/courriers-lancement-saint-etienne/01-ville-local-stockage.docx
@@ -63,7 +63,7 @@
           <w:color w:val="556070"/>
           <w:sz w:val="17"/>
         </w:rPr>
-        <w:t>25 rue Elise Gervais, 42000 Saint-Etienne | contact@territoiresvivantsfrance.fr | 06 22 03 93 24</w:t>
+        <w:t>25 rue Elise Gervais, 42000 Saint-Etienne | contact@territoiresvivantsfrance.fr | 04 65 81 54 69</w:t>
       </w:r>
     </w:p>
     <w:p>
@@ -488,7 +488,7 @@
         <w:br/>
       </w:r>
       <w:r>
-        <w:t>Contact : contact@territoiresvivantsfrance.fr - 06 22 03 93 24</w:t>
+        <w:t>Contact : contact@territoiresvivantsfrance.fr - 04 65 81 54 69</w:t>
       </w:r>
     </w:p>
     <w:p>

</xml_diff>